<commit_message>
auto(daily): dev loop report 2026-06-04
</commit_message>
<xml_diff>
--- a/reports/hypothesis/2026-06-04.docx
+++ b/reports/hypothesis/2026-06-04.docx
@@ -15,7 +15,7 @@
         <w:rPr>
           <w:i/>
         </w:rPr>
-        <w:t>생성일: 2026-06-04 09:15 KST  |  표본: 측정소당 최소 2244건 / 총 11395건</w:t>
+        <w:t>생성일: 2026-06-04 14:03 KST  |  표본: 측정소당 최소 2249건 / 총 11420건</w:t>
       </w:r>
     </w:p>
     <w:p>
@@ -143,7 +143,7 @@
           </w:tcPr>
           <w:p>
             <w:r>
-              <w:t>38.187</w:t>
+              <w:t>38.202</w:t>
             </w:r>
           </w:p>
         </w:tc>
@@ -153,7 +153,7 @@
           </w:tcPr>
           <w:p>
             <w:r>
-              <w:t>34.123</w:t>
+              <w:t>34.117</w:t>
             </w:r>
           </w:p>
         </w:tc>
@@ -163,7 +163,7 @@
           </w:tcPr>
           <w:p>
             <w:r>
-              <w:t>+4.064</w:t>
+              <w:t>+4.085</w:t>
             </w:r>
           </w:p>
         </w:tc>
@@ -215,7 +215,7 @@
           </w:tcPr>
           <w:p>
             <w:r>
-              <w:t>21.308</w:t>
+              <w:t>21.305</w:t>
             </w:r>
           </w:p>
         </w:tc>
@@ -225,7 +225,7 @@
           </w:tcPr>
           <w:p>
             <w:r>
-              <w:t>17.901</w:t>
+              <w:t>17.894</w:t>
             </w:r>
           </w:p>
         </w:tc>
@@ -235,7 +235,7 @@
           </w:tcPr>
           <w:p>
             <w:r>
-              <w:t>+3.407</w:t>
+              <w:t>+3.411</w:t>
             </w:r>
           </w:p>
         </w:tc>
@@ -409,7 +409,7 @@
           </w:tcPr>
           <w:p>
             <w:r>
-              <w:t>-0.22 (작음)</w:t>
+              <w:t>-0.21 (작음)</w:t>
             </w:r>
           </w:p>
         </w:tc>
@@ -660,7 +660,7 @@
           </w:tcPr>
           <w:p>
             <w:r>
-              <w:t>38.28</w:t>
+              <w:t>38.90</w:t>
             </w:r>
           </w:p>
         </w:tc>
@@ -722,7 +722,7 @@
           </w:tcPr>
           <w:p>
             <w:r>
-              <w:t>76.66</w:t>
+              <w:t>77.14</w:t>
             </w:r>
           </w:p>
         </w:tc>
@@ -784,7 +784,7 @@
           </w:tcPr>
           <w:p>
             <w:r>
-              <w:t>15.11</w:t>
+              <w:t>15.01</w:t>
             </w:r>
           </w:p>
         </w:tc>
@@ -846,7 +846,7 @@
           </w:tcPr>
           <w:p>
             <w:r>
-              <w:t>147.58</w:t>
+              <w:t>147.18</w:t>
             </w:r>
           </w:p>
         </w:tc>
@@ -908,7 +908,7 @@
           </w:tcPr>
           <w:p>
             <w:r>
-              <w:t>71.72</w:t>
+              <w:t>71.67</w:t>
             </w:r>
           </w:p>
         </w:tc>
@@ -970,7 +970,7 @@
           </w:tcPr>
           <w:p>
             <w:r>
-              <w:t>157.68</w:t>
+              <w:t>156.87</w:t>
             </w:r>
           </w:p>
         </w:tc>

</xml_diff>